<commit_message>
Fix DOC Formatting V1
</commit_message>
<xml_diff>
--- a/backend/DOCS/Aadhar.docx
+++ b/backend/DOCS/Aadhar.docx
@@ -353,16 +353,8 @@
         <w:rPr>
           <w:rFonts w:ascii="Calibri"/>
         </w:rPr>
-        <w:t>${CUSTOMER_</w:t>
-      </w:r>
-      <w:proofErr w:type="gramStart"/>
-      <w:r>
-        <w:rPr>
-          <w:rFonts w:ascii="Calibri"/>
-        </w:rPr>
-        <w:t>SIGN}$</w:t>
-      </w:r>
-      <w:proofErr w:type="gramEnd"/>
+        <w:t>${CUSTOMER_SIGN}$</w:t>
+      </w:r>
     </w:p>
     <w:p>
       <w:pPr>
@@ -488,16 +480,7 @@
           <w:color w:val="000000"/>
           <w:lang w:val="en-IN" w:eastAsia="en-IN"/>
         </w:rPr>
-        <w:t>CONSUMER_</w:t>
-      </w:r>
-      <w:proofErr w:type="gramStart"/>
-      <w:r>
-        <w:rPr>
-          <w:rFonts w:ascii="Calibri" w:hAnsi="Calibri" w:cs="Calibri"/>
-          <w:color w:val="000000"/>
-          <w:lang w:val="en-IN" w:eastAsia="en-IN"/>
-        </w:rPr>
-        <w:t>NAME</w:t>
+        <w:t>CONSUMER_NAME</w:t>
       </w:r>
       <w:r>
         <w:rPr>
@@ -506,7 +489,6 @@
         </w:rPr>
         <w:t>}$</w:t>
       </w:r>
-      <w:proofErr w:type="gramEnd"/>
     </w:p>
     <w:p>
       <w:pPr>
@@ -546,17 +528,8 @@
           <w:rFonts w:ascii="Calibri" w:hAnsi="Calibri"/>
           <w:spacing w:val="-2"/>
         </w:rPr>
-        <w:t>${CONSUMER_</w:t>
-      </w:r>
-      <w:proofErr w:type="gramStart"/>
-      <w:r>
-        <w:rPr>
-          <w:rFonts w:ascii="Calibri" w:hAnsi="Calibri"/>
-          <w:spacing w:val="-2"/>
-        </w:rPr>
-        <w:t>AADHAR}$</w:t>
-      </w:r>
-      <w:proofErr w:type="gramEnd"/>
+        <w:t>${CONSUMER_AADHAR}$</w:t>
+      </w:r>
     </w:p>
     <w:p>
       <w:pPr>
@@ -600,17 +573,29 @@
           <w:rFonts w:ascii="Calibri"/>
           <w:sz w:val="20"/>
         </w:rPr>
-        <w:t>${CUSTOMER_</w:t>
-      </w:r>
-      <w:proofErr w:type="gramStart"/>
+        <w:t>${</w:t>
+      </w:r>
       <w:r>
         <w:rPr>
           <w:rFonts w:ascii="Calibri"/>
           <w:sz w:val="20"/>
         </w:rPr>
-        <w:t>PHOTO}$</w:t>
-      </w:r>
-      <w:proofErr w:type="gramEnd"/>
+        <w:t>AADHAR_FRONT</w:t>
+      </w:r>
+      <w:r>
+        <w:rPr>
+          <w:rFonts w:ascii="Calibri"/>
+          <w:sz w:val="20"/>
+        </w:rPr>
+        <w:t>}$</w:t>
+      </w:r>
+      <w:r>
+        <w:rPr>
+          <w:rFonts w:ascii="Calibri"/>
+          <w:sz w:val="20"/>
+        </w:rPr>
+        <w:t xml:space="preserve"> ${AADHAR_BACK}$</w:t>
+      </w:r>
     </w:p>
     <w:p>
       <w:pPr>
@@ -621,372 +606,6 @@
           <w:sz w:val="20"/>
         </w:rPr>
       </w:pPr>
-      <w:r>
-        <w:rPr>
-          <w:rFonts w:ascii="Calibri"/>
-          <w:noProof/>
-          <w:sz w:val="20"/>
-        </w:rPr>
-        <mc:AlternateContent>
-          <mc:Choice Requires="wps">
-            <w:drawing>
-              <wp:anchor distT="0" distB="0" distL="0" distR="0" simplePos="0" relativeHeight="251659264" behindDoc="1" locked="0" layoutInCell="1" allowOverlap="1" wp14:anchorId="1B649A9F" wp14:editId="104CBACA">
-                <wp:simplePos x="0" y="0"/>
-                <wp:positionH relativeFrom="margin">
-                  <wp:align>center</wp:align>
-                </wp:positionH>
-                <wp:positionV relativeFrom="paragraph">
-                  <wp:posOffset>434340</wp:posOffset>
-                </wp:positionV>
-                <wp:extent cx="4762500" cy="2371725"/>
-                <wp:effectExtent l="0" t="0" r="19050" b="28575"/>
-                <wp:wrapTopAndBottom/>
-                <wp:docPr id="4" name="Textbox 4"/>
-                <wp:cNvGraphicFramePr>
-                  <a:graphicFrameLocks xmlns:a="http://schemas.openxmlformats.org/drawingml/2006/main"/>
-                </wp:cNvGraphicFramePr>
-                <a:graphic xmlns:a="http://schemas.openxmlformats.org/drawingml/2006/main">
-                  <a:graphicData uri="http://schemas.microsoft.com/office/word/2010/wordprocessingShape">
-                    <wps:wsp>
-                      <wps:cNvSpPr txBox="1">
-                        <a:spLocks/>
-                      </wps:cNvSpPr>
-                      <wps:spPr>
-                        <a:xfrm>
-                          <a:off x="0" y="0"/>
-                          <a:ext cx="4762500" cy="2371725"/>
-                        </a:xfrm>
-                        <a:prstGeom prst="rect">
-                          <a:avLst/>
-                        </a:prstGeom>
-                        <a:ln w="6350">
-                          <a:solidFill>
-                            <a:srgbClr val="000000"/>
-                          </a:solidFill>
-                          <a:prstDash val="solid"/>
-                        </a:ln>
-                      </wps:spPr>
-                      <wps:txbx>
-                        <w:txbxContent>
-                          <w:p>
-                            <w:pPr>
-                              <w:pStyle w:val="BodyText"/>
-                              <w:rPr>
-                                <w:rFonts w:ascii="Calibri"/>
-                                <w:sz w:val="22"/>
-                              </w:rPr>
-                            </w:pPr>
-                          </w:p>
-                          <w:p>
-                            <w:pPr>
-                              <w:pStyle w:val="BodyText"/>
-                              <w:jc w:val="center"/>
-                              <w:rPr>
-                                <w:rFonts w:ascii="Calibri"/>
-                                <w:sz w:val="20"/>
-                              </w:rPr>
-                            </w:pPr>
-                          </w:p>
-                          <w:p>
-                            <w:pPr>
-                              <w:pStyle w:val="BodyText"/>
-                              <w:jc w:val="center"/>
-                              <w:rPr>
-                                <w:rFonts w:ascii="Calibri"/>
-                                <w:sz w:val="20"/>
-                              </w:rPr>
-                            </w:pPr>
-                          </w:p>
-                          <w:p>
-                            <w:pPr>
-                              <w:pStyle w:val="BodyText"/>
-                              <w:jc w:val="center"/>
-                              <w:rPr>
-                                <w:rFonts w:ascii="Calibri"/>
-                                <w:sz w:val="20"/>
-                              </w:rPr>
-                            </w:pPr>
-                          </w:p>
-                          <w:p>
-                            <w:pPr>
-                              <w:pStyle w:val="BodyText"/>
-                              <w:jc w:val="center"/>
-                              <w:rPr>
-                                <w:rFonts w:ascii="Calibri"/>
-                                <w:sz w:val="20"/>
-                              </w:rPr>
-                            </w:pPr>
-                            <w:r>
-                              <w:rPr>
-                                <w:rFonts w:ascii="Calibri"/>
-                                <w:sz w:val="20"/>
-                              </w:rPr>
-                              <w:t>${CUSTOMER_</w:t>
-                            </w:r>
-                            <w:proofErr w:type="gramStart"/>
-                            <w:r>
-                              <w:rPr>
-                                <w:rFonts w:ascii="Calibri"/>
-                                <w:sz w:val="20"/>
-                              </w:rPr>
-                              <w:t>PHOTO}$</w:t>
-                            </w:r>
-                            <w:proofErr w:type="gramEnd"/>
-                          </w:p>
-                          <w:p>
-                            <w:pPr>
-                              <w:spacing w:line="453" w:lineRule="auto"/>
-                              <w:ind w:left="1833" w:right="1833" w:firstLine="244"/>
-                              <w:rPr>
-                                <w:rFonts w:ascii="Calibri"/>
-                              </w:rPr>
-                            </w:pPr>
-                            <w:r>
-                              <w:rPr>
-                                <w:rFonts w:ascii="Calibri"/>
-                              </w:rPr>
-                              <w:t>Upload Xerox of AADHAR CARD HERE SHOULD</w:t>
-                            </w:r>
-                            <w:r>
-                              <w:rPr>
-                                <w:rFonts w:ascii="Calibri"/>
-                                <w:spacing w:val="-9"/>
-                              </w:rPr>
-                              <w:t xml:space="preserve"> </w:t>
-                            </w:r>
-                            <w:r>
-                              <w:rPr>
-                                <w:rFonts w:ascii="Calibri"/>
-                              </w:rPr>
-                              <w:t>BE</w:t>
-                            </w:r>
-                            <w:r>
-                              <w:rPr>
-                                <w:rFonts w:ascii="Calibri"/>
-                                <w:spacing w:val="-7"/>
-                              </w:rPr>
-                              <w:t xml:space="preserve"> </w:t>
-                            </w:r>
-                            <w:r>
-                              <w:rPr>
-                                <w:rFonts w:ascii="Calibri"/>
-                              </w:rPr>
-                              <w:t>SELF</w:t>
-                            </w:r>
-                            <w:r>
-                              <w:rPr>
-                                <w:rFonts w:ascii="Calibri"/>
-                                <w:spacing w:val="-7"/>
-                              </w:rPr>
-                              <w:t xml:space="preserve"> </w:t>
-                            </w:r>
-                            <w:r>
-                              <w:rPr>
-                                <w:rFonts w:ascii="Calibri"/>
-                              </w:rPr>
-                              <w:t>ATTESTED</w:t>
-                            </w:r>
-                            <w:r>
-                              <w:rPr>
-                                <w:rFonts w:ascii="Calibri"/>
-                                <w:spacing w:val="-9"/>
-                              </w:rPr>
-                              <w:t xml:space="preserve"> </w:t>
-                            </w:r>
-                            <w:r>
-                              <w:rPr>
-                                <w:rFonts w:ascii="Calibri"/>
-                              </w:rPr>
-                              <w:t>BY</w:t>
-                            </w:r>
-                            <w:r>
-                              <w:rPr>
-                                <w:rFonts w:ascii="Calibri"/>
-                                <w:spacing w:val="-7"/>
-                              </w:rPr>
-                              <w:t xml:space="preserve"> </w:t>
-                            </w:r>
-                            <w:r>
-                              <w:rPr>
-                                <w:rFonts w:ascii="Calibri"/>
-                              </w:rPr>
-                              <w:t>CONSUMER</w:t>
-                            </w:r>
-                          </w:p>
-                        </w:txbxContent>
-                      </wps:txbx>
-                      <wps:bodyPr wrap="square" lIns="0" tIns="0" rIns="0" bIns="0" rtlCol="0">
-                        <a:noAutofit/>
-                      </wps:bodyPr>
-                    </wps:wsp>
-                  </a:graphicData>
-                </a:graphic>
-              </wp:anchor>
-            </w:drawing>
-          </mc:Choice>
-          <mc:Fallback>
-            <w:pict>
-              <v:shapetype w14:anchorId="1B649A9F" id="_x0000_t202" coordsize="21600,21600" o:spt="202" path="m,l,21600r21600,l21600,xe">
-                <v:stroke joinstyle="miter"/>
-                <v:path gradientshapeok="t" o:connecttype="rect"/>
-              </v:shapetype>
-              <v:shape id="Textbox 4" o:spid="_x0000_s1026" type="#_x0000_t202" style="position:absolute;margin-left:0;margin-top:34.2pt;width:375pt;height:186.75pt;z-index:-251657216;visibility:visible;mso-wrap-style:square;mso-wrap-distance-left:0;mso-wrap-distance-top:0;mso-wrap-distance-right:0;mso-wrap-distance-bottom:0;mso-position-horizontal:center;mso-position-horizontal-relative:margin;mso-position-vertical:absolute;mso-position-vertical-relative:text;v-text-anchor:top" o:gfxdata="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" filled="f" strokeweight=".5pt">
-                <v:path arrowok="t"/>
-                <v:textbox inset="0,0,0,0">
-                  <w:txbxContent>
-                    <w:p>
-                      <w:pPr>
-                        <w:pStyle w:val="BodyText"/>
-                        <w:rPr>
-                          <w:rFonts w:ascii="Calibri"/>
-                          <w:sz w:val="22"/>
-                        </w:rPr>
-                      </w:pPr>
-                    </w:p>
-                    <w:p>
-                      <w:pPr>
-                        <w:pStyle w:val="BodyText"/>
-                        <w:jc w:val="center"/>
-                        <w:rPr>
-                          <w:rFonts w:ascii="Calibri"/>
-                          <w:sz w:val="20"/>
-                        </w:rPr>
-                      </w:pPr>
-                    </w:p>
-                    <w:p>
-                      <w:pPr>
-                        <w:pStyle w:val="BodyText"/>
-                        <w:jc w:val="center"/>
-                        <w:rPr>
-                          <w:rFonts w:ascii="Calibri"/>
-                          <w:sz w:val="20"/>
-                        </w:rPr>
-                      </w:pPr>
-                    </w:p>
-                    <w:p>
-                      <w:pPr>
-                        <w:pStyle w:val="BodyText"/>
-                        <w:jc w:val="center"/>
-                        <w:rPr>
-                          <w:rFonts w:ascii="Calibri"/>
-                          <w:sz w:val="20"/>
-                        </w:rPr>
-                      </w:pPr>
-                    </w:p>
-                    <w:p>
-                      <w:pPr>
-                        <w:pStyle w:val="BodyText"/>
-                        <w:jc w:val="center"/>
-                        <w:rPr>
-                          <w:rFonts w:ascii="Calibri"/>
-                          <w:sz w:val="20"/>
-                        </w:rPr>
-                      </w:pPr>
-                      <w:r>
-                        <w:rPr>
-                          <w:rFonts w:ascii="Calibri"/>
-                          <w:sz w:val="20"/>
-                        </w:rPr>
-                        <w:t>${CUSTOMER_</w:t>
-                      </w:r>
-                      <w:proofErr w:type="gramStart"/>
-                      <w:r>
-                        <w:rPr>
-                          <w:rFonts w:ascii="Calibri"/>
-                          <w:sz w:val="20"/>
-                        </w:rPr>
-                        <w:t>PHOTO}$</w:t>
-                      </w:r>
-                      <w:proofErr w:type="gramEnd"/>
-                    </w:p>
-                    <w:p>
-                      <w:pPr>
-                        <w:spacing w:line="453" w:lineRule="auto"/>
-                        <w:ind w:left="1833" w:right="1833" w:firstLine="244"/>
-                        <w:rPr>
-                          <w:rFonts w:ascii="Calibri"/>
-                        </w:rPr>
-                      </w:pPr>
-                      <w:r>
-                        <w:rPr>
-                          <w:rFonts w:ascii="Calibri"/>
-                        </w:rPr>
-                        <w:t>Upload Xerox of AADHAR CARD HERE SHOULD</w:t>
-                      </w:r>
-                      <w:r>
-                        <w:rPr>
-                          <w:rFonts w:ascii="Calibri"/>
-                          <w:spacing w:val="-9"/>
-                        </w:rPr>
-                        <w:t xml:space="preserve"> </w:t>
-                      </w:r>
-                      <w:r>
-                        <w:rPr>
-                          <w:rFonts w:ascii="Calibri"/>
-                        </w:rPr>
-                        <w:t>BE</w:t>
-                      </w:r>
-                      <w:r>
-                        <w:rPr>
-                          <w:rFonts w:ascii="Calibri"/>
-                          <w:spacing w:val="-7"/>
-                        </w:rPr>
-                        <w:t xml:space="preserve"> </w:t>
-                      </w:r>
-                      <w:r>
-                        <w:rPr>
-                          <w:rFonts w:ascii="Calibri"/>
-                        </w:rPr>
-                        <w:t>SELF</w:t>
-                      </w:r>
-                      <w:r>
-                        <w:rPr>
-                          <w:rFonts w:ascii="Calibri"/>
-                          <w:spacing w:val="-7"/>
-                        </w:rPr>
-                        <w:t xml:space="preserve"> </w:t>
-                      </w:r>
-                      <w:r>
-                        <w:rPr>
-                          <w:rFonts w:ascii="Calibri"/>
-                        </w:rPr>
-                        <w:t>ATTESTED</w:t>
-                      </w:r>
-                      <w:r>
-                        <w:rPr>
-                          <w:rFonts w:ascii="Calibri"/>
-                          <w:spacing w:val="-9"/>
-                        </w:rPr>
-                        <w:t xml:space="preserve"> </w:t>
-                      </w:r>
-                      <w:r>
-                        <w:rPr>
-                          <w:rFonts w:ascii="Calibri"/>
-                        </w:rPr>
-                        <w:t>BY</w:t>
-                      </w:r>
-                      <w:r>
-                        <w:rPr>
-                          <w:rFonts w:ascii="Calibri"/>
-                          <w:spacing w:val="-7"/>
-                        </w:rPr>
-                        <w:t xml:space="preserve"> </w:t>
-                      </w:r>
-                      <w:r>
-                        <w:rPr>
-                          <w:rFonts w:ascii="Calibri"/>
-                        </w:rPr>
-                        <w:t>CONSUMER</w:t>
-                      </w:r>
-                    </w:p>
-                  </w:txbxContent>
-                </v:textbox>
-                <w10:wrap type="topAndBottom" anchorx="margin"/>
-              </v:shape>
-            </w:pict>
-          </mc:Fallback>
-        </mc:AlternateContent>
-      </w:r>
     </w:p>
     <w:p/>
     <w:sectPr>

</xml_diff>

<commit_message>
Fix DOC Formatting V2
</commit_message>
<xml_diff>
--- a/backend/DOCS/Aadhar.docx
+++ b/backend/DOCS/Aadhar.docx
@@ -353,8 +353,16 @@
         <w:rPr>
           <w:rFonts w:ascii="Calibri"/>
         </w:rPr>
-        <w:t>${CUSTOMER_SIGN}$</w:t>
-      </w:r>
+        <w:t>${CUSTOMER_</w:t>
+      </w:r>
+      <w:proofErr w:type="gramStart"/>
+      <w:r>
+        <w:rPr>
+          <w:rFonts w:ascii="Calibri"/>
+        </w:rPr>
+        <w:t>SIGN}$</w:t>
+      </w:r>
+      <w:proofErr w:type="gramEnd"/>
     </w:p>
     <w:p>
       <w:pPr>
@@ -480,7 +488,16 @@
           <w:color w:val="000000"/>
           <w:lang w:val="en-IN" w:eastAsia="en-IN"/>
         </w:rPr>
-        <w:t>CONSUMER_NAME</w:t>
+        <w:t>CONSUMER_</w:t>
+      </w:r>
+      <w:proofErr w:type="gramStart"/>
+      <w:r>
+        <w:rPr>
+          <w:rFonts w:ascii="Calibri" w:hAnsi="Calibri" w:cs="Calibri"/>
+          <w:color w:val="000000"/>
+          <w:lang w:val="en-IN" w:eastAsia="en-IN"/>
+        </w:rPr>
+        <w:t>NAME</w:t>
       </w:r>
       <w:r>
         <w:rPr>
@@ -489,6 +506,7 @@
         </w:rPr>
         <w:t>}$</w:t>
       </w:r>
+      <w:proofErr w:type="gramEnd"/>
     </w:p>
     <w:p>
       <w:pPr>
@@ -528,8 +546,17 @@
           <w:rFonts w:ascii="Calibri" w:hAnsi="Calibri"/>
           <w:spacing w:val="-2"/>
         </w:rPr>
-        <w:t>${CONSUMER_AADHAR}$</w:t>
-      </w:r>
+        <w:t>${CONSUMER_</w:t>
+      </w:r>
+      <w:proofErr w:type="gramStart"/>
+      <w:r>
+        <w:rPr>
+          <w:rFonts w:ascii="Calibri" w:hAnsi="Calibri"/>
+          <w:spacing w:val="-2"/>
+        </w:rPr>
+        <w:t>AADHAR}$</w:t>
+      </w:r>
+      <w:proofErr w:type="gramEnd"/>
     </w:p>
     <w:p>
       <w:pPr>
@@ -562,7 +589,6 @@
     <w:p>
       <w:pPr>
         <w:pStyle w:val="BodyText"/>
-        <w:jc w:val="center"/>
         <w:rPr>
           <w:rFonts w:ascii="Calibri"/>
           <w:sz w:val="20"/>
@@ -580,22 +606,40 @@
           <w:rFonts w:ascii="Calibri"/>
           <w:sz w:val="20"/>
         </w:rPr>
-        <w:t>AADHAR_FRONT</w:t>
-      </w:r>
+        <w:t>AADHAR_</w:t>
+      </w:r>
+      <w:proofErr w:type="gramStart"/>
       <w:r>
         <w:rPr>
           <w:rFonts w:ascii="Calibri"/>
           <w:sz w:val="20"/>
         </w:rPr>
+        <w:t>FRONT</w:t>
+      </w:r>
+      <w:r>
+        <w:rPr>
+          <w:rFonts w:ascii="Calibri"/>
+          <w:sz w:val="20"/>
+        </w:rPr>
         <w:t>}$</w:t>
       </w:r>
+      <w:proofErr w:type="gramEnd"/>
       <w:r>
         <w:rPr>
           <w:rFonts w:ascii="Calibri"/>
           <w:sz w:val="20"/>
         </w:rPr>
-        <w:t xml:space="preserve"> ${AADHAR_BACK}$</w:t>
-      </w:r>
+        <w:t xml:space="preserve"> ${AADHAR_</w:t>
+      </w:r>
+      <w:proofErr w:type="gramStart"/>
+      <w:r>
+        <w:rPr>
+          <w:rFonts w:ascii="Calibri"/>
+          <w:sz w:val="20"/>
+        </w:rPr>
+        <w:t>BACK}$</w:t>
+      </w:r>
+      <w:proofErr w:type="gramEnd"/>
     </w:p>
     <w:p>
       <w:pPr>

</xml_diff>